<commit_message>
cap nhat nhat ky thuc tap tuan 3
</commit_message>
<xml_diff>
--- a/2351010080_TranQuocHuy_BCTTTN.docx
+++ b/2351010080_TranQuocHuy_BCTTTN.docx
@@ -11326,6 +11326,24 @@
                 <w:lang w:val="en-US"/>
               </w:rPr>
             </w:pPr>
+            <w:r>
+              <w:t>Tiếp tục nghiên cứu cấu trúc mã nguồn của hệ thống, bao gồm phần giao diện, Backend, cơ sở dữ liệu MySQL và các API xử lý nghiệp vụ</w:t>
+            </w:r>
+            <w:r>
+              <w:rPr>
+                <w:lang w:val="en-US"/>
+              </w:rPr>
+              <w:t xml:space="preserve"> trong hệ thống</w:t>
+            </w:r>
+            <w:r>
+              <w:rPr>
+                <w:lang w:val="en-US"/>
+              </w:rPr>
+              <w:t xml:space="preserve">. </w:t>
+            </w:r>
+            <w:r>
+              <w:t>Theo dõi luồng dữ liệu từ giao diện đến API và cơ sở dữ liệu đối với các chức năng quản lý sản phẩm, nhập kho, bán hàng, điều chuyển và theo dõi tồn kho. Kiểm tra cách giao diện ReactJS kết nối và nhận dữ liệu từ Backend. Đồng thời phân chia các nhóm chức năng cần thực hiện, lập danh sách công việc và trao đổi với người hướng dẫn về tiến độ phát triển.</w:t>
+            </w:r>
           </w:p>
         </w:tc>
         <w:tc>
@@ -11343,6 +11361,33 @@
                 <w:lang w:val="en-US"/>
               </w:rPr>
             </w:pPr>
+            <w:r>
+              <w:t>Đã xác định được cách tổ chức mã ng</w:t>
+            </w:r>
+            <w:r>
+              <w:rPr>
+                <w:lang w:val="en-US"/>
+              </w:rPr>
+              <w:t>uồn</w:t>
+            </w:r>
+            <w:r>
+              <w:t xml:space="preserve">. Hiểu được luồng xử lý khi người dùng thực hiện các thao tác liên quan đến sản phẩm, nhập hàng, bán hàng và tồn kho. Đã chạy thử </w:t>
+            </w:r>
+            <w:r>
+              <w:rPr>
+                <w:lang w:val="en-US"/>
+              </w:rPr>
+              <w:t xml:space="preserve">vài </w:t>
+            </w:r>
+            <w:r>
+              <w:t>API, kiểm tra dữ liệu trả về và xác định được cách giao diện ReactJS hiển thị dữ liệu từ Backend. Hoàn thành danh sách các module cần phát triển. Đồng thời lập kế hoạch ưu tiên phát triển Backend trước, sau đó kết nối và hoàn thiện giao diện</w:t>
+            </w:r>
+            <w:r>
+              <w:rPr>
+                <w:lang w:val="en-US"/>
+              </w:rPr>
+              <w:t>.</w:t>
+            </w:r>
           </w:p>
         </w:tc>
         <w:tc>
@@ -11387,6 +11432,7 @@
               <w:rPr>
                 <w:lang w:val="en-US"/>
               </w:rPr>
+              <w:lastRenderedPageBreak/>
               <w:t>Tuần 4</w:t>
             </w:r>
           </w:p>
@@ -11775,7 +11821,6 @@
               <w:rPr>
                 <w:lang w:val="en-US"/>
               </w:rPr>
-              <w:lastRenderedPageBreak/>
               <w:t>Tuần 8</w:t>
             </w:r>
           </w:p>
@@ -12067,6 +12112,7 @@
               <w:rPr>
                 <w:lang w:val="en-US"/>
               </w:rPr>
+              <w:lastRenderedPageBreak/>
               <w:t>Tuần 11</w:t>
             </w:r>
             <w:r>

</xml_diff>